<commit_message>
docs: update DeepHire security passport
Add missing architecture components from draw.io diagrams:
- Internal API Gateway / Service Mesh (Application Zone)
- Admin Panel as explicit component
- Ingestion Pipeline / Connector (bge-m3:latest, 1024-dim COSINE)
- Knowledge Sources Zone (Cleverstaff/DWH, HH.uz/LinkedIn)
- Nginx /nexus route to Management Zone
- Supporting Services (Management Zone): Nexus full artifact types
  PyPI · Maven · npm · Docker images · HuggingFace mirror
- mTLS and Data Layer TLS-in-transit notes
- Management Zone full description (GitLab, Nexus, Langfuse, Monitoring)
- Log sources list → Log Collector → IBM QRadar SIEM (12 sources)
- Sandbox/AV between Internet zone and Application Zone

Co-Authored-By: Claude Sonnet 4.6 <noreply@anthropic.com>
</commit_message>
<xml_diff>
--- a/doc/passport_deephire_filled.docx
+++ b/doc/passport_deephire_filled.docx
@@ -221,6 +221,11 @@
       </w:r>
     </w:p>
     <w:p>
+      <w:r>
+        <w:t>Admin Panel (Management UI) — веб-интерфейс управления платформой: CRUD пользователей, управление агентами/документами/MCP-серверами, просмотр метрик, HITL approval queue; доступен только роли admin;</w:t>
+      </w:r>
+    </w:p>
+    <w:p>
       <w:pPr>
         <w:numPr>
           <w:ilvl w:val="0"/>
@@ -250,7 +255,7 @@
         </w:numPr>
       </w:pPr>
       <w:r>
-        <w:t>Reverse Proxy — Nginx (порт 8385 внешний): Terminates HTTPS/TLS; /api/ → backend, / → frontend, /callback → backend OAuth2;</w:t>
+        <w:t>Reverse Proxy — Nginx (порт 8385 внешний): Terminates HTTPS/TLS; /api/ → backend, / → frontend, /callback → backend OAuth2; /nexus → Nexus Repository (DevOps artifact pulls);</w:t>
       </w:r>
     </w:p>
     <w:p>
@@ -296,6 +301,11 @@
       </w:r>
     </w:p>
     <w:p>
+      <w:r>
+        <w:t>Ingestion Pipeline — парсинг резюме (PyMuPDF / python-docx), bge-m3:latest embeddings (1024-dim COSINE) → Qdrant (uzbek_candidates); источники: HH.uz API (OAuth2) / LinkedIn / файловая загрузка (PDF/DOCX); Ingestion Connector (crawler → chunk → embed → index); Sandbox / AV (Фильтрация + Антивирус) перед Application Zone для данных из Internet;</w:t>
+      </w:r>
+    </w:p>
+    <w:p>
       <w:pPr>
         <w:numPr>
           <w:ilvl w:val="0"/>
@@ -304,6 +314,11 @@
       </w:pPr>
       <w:r>
         <w:t>LLM Inference — GPU Cluster (on-prem): LLM Serving (vLLM/TGI/Ollama) + GPU nodes (Llama/Qwen/bge-m3:latest);</w:t>
+      </w:r>
+    </w:p>
+    <w:p>
+      <w:r>
+        <w:t>Supporting Services (Management Zone) — Nexus Repository (локальный реестр: PyPI · Maven · npm · Docker images · HuggingFace mirror — airgapped, без выхода в интернет); Langfuse (LLM observability/tracing: промпты, latency, token usage, evals); GitLab (CI/CD pipeline, code review, container scanning, secrets scanning); Monitoring (Prometheus / Grafana / Zabbix — метрики CPU/RAM/disk/network всех хостов);</w:t>
       </w:r>
     </w:p>
     <w:p>
@@ -325,6 +340,11 @@
       </w:r>
     </w:p>
     <w:p>
+      <w:r>
+        <w:t>Knowledge Sources Zone — Cleverstaff / DWH (база кандидатов); HH.uz / LinkedIn (Internet zone) → Sandbox/AV → Application Zone; файловая загрузка PDF/DOCX; Ingestion Connector → Qdrant uzbek_candidates + MinIO;</w:t>
+      </w:r>
+    </w:p>
+    <w:p>
       <w:pPr>
         <w:numPr>
           <w:ilvl w:val="0"/>
@@ -377,6 +397,11 @@
       </w:pPr>
       <w:r>
         <w:t>Management Zone.</w:t>
+      </w:r>
+    </w:p>
+    <w:p>
+      <w:r>
+        <w:t>Состав Management Zone: GitLab (CI/CD, версионный контроль), Nexus Repository (airgapped artifact registry), Langfuse (LLM tracing/observability), Monitoring (Prometheus/Grafana/Zabbix). Доступ: исключительно DevOps/MLOps через management VLAN/VPN. Пользователи и администраторы не имеют прямого доступа в Management Zone.</w:t>
       </w:r>
     </w:p>
     <w:p>
@@ -579,6 +604,11 @@
     <w:p>
       <w:r>
         <w:t>Перечень сетевых взаимодействий, IP/FQDN, портов и протоколов приведён в Приложении.</w:t>
+      </w:r>
+    </w:p>
+    <w:p>
+      <w:r>
+        <w:t>Весь cross-zone трафик шифруется: mTLS где возможно (сервисная сетка), TLS 1.2+ для всех внешних и межзонных соединений. Data Layer: хранилища данных (MongoDB, PostgreSQL, Qdrant, Redis, MinIO, Elasticsearch) доступны исключительно из внутренней сети, без прямого внешнего exposure; TLS in transit.</w:t>
       </w:r>
     </w:p>
     <w:p/>
@@ -1171,6 +1201,21 @@
         <w:t>Среды DEV, TEST/UAT и PROD разделены на сетевом и инфраструктурном уровнях.</w:t>
       </w:r>
     </w:p>
+    <w:p>
+      <w:r>
+        <w:t>Management Zone изолирована от User Zone и Application Zone. Компоненты Management Zone (GitLab, Nexus, Langfuse, Monitoring) размещены в выделенном сетевом сегменте. Доступ к Management Zone ограничен:</w:t>
+        <w:br/>
+        <w:t xml:space="preserve">  • только DevOps/MLOps через management VLAN и/или VPN;</w:t>
+        <w:br/>
+        <w:t xml:space="preserve">  • Nexus доступен из Application Zone исключительно на pull (образы/пакеты) — без write-доступа;</w:t>
+        <w:br/>
+        <w:t xml:space="preserve">  • Langfuse принимает только исходящие traces от Orchestrator (outbound only из App Zone);</w:t>
+        <w:br/>
+        <w:t xml:space="preserve">  • Monitoring scrapes метрики с хостов — read-only доступ к exposition endpoints;</w:t>
+        <w:br/>
+        <w:t xml:space="preserve">  • GitLab CI/CD runner деплоит в Application Zone через защищённый канал.</w:t>
+      </w:r>
+    </w:p>
     <w:p/>
     <w:p>
       <w:pPr>
@@ -1469,6 +1514,35 @@
     <w:p>
       <w:r>
         <w:t>Мониторинг безопасности осуществляется SOC Банка.</w:t>
+      </w:r>
+    </w:p>
+    <w:p>
+      <w:r>
+        <w:t>Источники логов, передающих события в Log Collector → IBM QRadar SIEM:</w:t>
+        <w:br/>
+        <w:t xml:space="preserve">  • Nginx (access log, error log) → Log Collector;</w:t>
+        <w:br/>
+        <w:t xml:space="preserve">  • Active Directory / SSO → Log Collector (auth events: login, logout, lockout);</w:t>
+        <w:br/>
+        <w:t xml:space="preserve">  • AI UI / Backend (FastAPI application log) → Log Collector;</w:t>
+        <w:br/>
+        <w:t xml:space="preserve">  • Admin Panel → Log Collector;</w:t>
+        <w:br/>
+        <w:t xml:space="preserve">  • Internal API Gateway / Service Mesh → Log Collector;</w:t>
+        <w:br/>
+        <w:t xml:space="preserve">  • LLM Serving (vLLM/TGI/Ollama) → Log Collector;</w:t>
+        <w:br/>
+        <w:t xml:space="preserve">  • GPU nodes (system log) → Log Collector;</w:t>
+        <w:br/>
+        <w:t xml:space="preserve">  • PostgreSQL (pg_audit) → Log Collector;</w:t>
+        <w:br/>
+        <w:t xml:space="preserve">  • MinIO (audit log) → Log Collector;</w:t>
+        <w:br/>
+        <w:t xml:space="preserve">  • Nexus Repository (access log) → Log Collector;</w:t>
+        <w:br/>
+        <w:t xml:space="preserve">  • Langfuse (observability events) → Log Collector;</w:t>
+        <w:br/>
+        <w:t xml:space="preserve">  Log Collector (Filebeat / Fluent Bit / WinLogBeat) → QRadar SIEM по LEEF/Syslog (TLS).</w:t>
       </w:r>
     </w:p>
     <w:p/>

</xml_diff>